<commit_message>
docs: staging steps for the SEO team after PRs #1-#3
Adds a section 0 to the SEO tracker response (Markdown and Word): deploy
the theme zip from setup/staging-and-deployment, create the Make a Payment
page, remove the old Smile Reveal footer script, run the Slim SEO hand-off,
and what's still open (redirects, launch-day settings). Also notes that
the Harrisonburg town page now takes its text from the theme.

Co-Authored-By: Claude Opus 5.5 <noreply@anthropic.com>
</commit_message>
<xml_diff>
--- a/docs/seo/Dr-Burns-SEO-Tracker-Developer-Response-2026-10-20.docx
+++ b/docs/seo/Dr-Burns-SEO-Tracker-Developer-Response-2026-10-20.docx
@@ -37,7 +37,7 @@
         <w:rPr>
           <w:color w:val="6B6B6B"/>
         </w:rPr>
-        <w:t xml:space="preserve">October 20, 2026</w:t>
+        <w:t xml:space="preserve">October 20, 2026 · updated October 25, 2026</w:t>
       </w:r>
       <w:r>
         <w:rPr>
@@ -51,7 +51,55 @@
         <w:pStyle w:val="Heading1"/>
       </w:pPr>
       <w:r>
-        <w:t xml:space="preserve">At a glance</w:t>
+        <w:t xml:space="preserve">Update, October 25: staging steps, in order</w:t>
+      </w:r>
+    </w:p>
+    <w:p>
+      <w:pPr>
+        <w:spacing w:after="120"/>
+      </w:pPr>
+      <w:r>
+        <w:t xml:space="preserve">Three updates are now merged: this SEO tracker work, the GoHighLevel quiz, smile preview and free guide, and the Harrisonburg and Make a Payment pages. The </w:t>
+      </w:r>
+      <w:r>
+        <w:rPr>
+          <w:rFonts w:ascii="Consolas" w:cs="Consolas" w:eastAsia="Consolas" w:hAnsi="Consolas"/>
+          <w:sz w:val="19"/>
+          <w:szCs w:val="19"/>
+        </w:rPr>
+        <w:t xml:space="preserve">setup/staging-and-deployment</w:t>
+      </w:r>
+      <w:r>
+        <w:t xml:space="preserve"> branch now matches </w:t>
+      </w:r>
+      <w:r>
+        <w:rPr>
+          <w:rFonts w:ascii="Consolas" w:cs="Consolas" w:eastAsia="Consolas" w:hAnsi="Consolas"/>
+          <w:sz w:val="19"/>
+          <w:szCs w:val="19"/>
+        </w:rPr>
+        <w:t xml:space="preserve">main</w:t>
+      </w:r>
+      <w:r>
+        <w:t xml:space="preserve">. Staging was still running theme </w:t>
+      </w:r>
+      <w:r>
+        <w:rPr>
+          <w:b/>
+          <w:bCs/>
+        </w:rPr>
+        <w:t xml:space="preserve">1.2.7</w:t>
+      </w:r>
+      <w:r>
+        <w:t xml:space="preserve"> when we checked on October 25, so none of this is visible there yet.</w:t>
+      </w:r>
+    </w:p>
+    <w:p>
+      <w:pPr>
+        <w:pStyle w:val="Heading2"/>
+      </w:pPr>
+      <w:r>
+        <w:t xml:space="preserve">Step 1: deploy (everything else depends on this)</w:t>
       </w:r>
     </w:p>
     <w:p>
@@ -61,6 +109,334 @@
           <w:ilvl w:val="0"/>
           <w:numId w:val="2"/>
         </w:numPr>
+        <w:spacing w:after="80"/>
+      </w:pPr>
+      <w:r>
+        <w:t xml:space="preserve">Build the theme zip from </w:t>
+      </w:r>
+      <w:r>
+        <w:rPr>
+          <w:rFonts w:ascii="Consolas" w:cs="Consolas" w:eastAsia="Consolas" w:hAnsi="Consolas"/>
+          <w:sz w:val="19"/>
+          <w:szCs w:val="19"/>
+        </w:rPr>
+        <w:t xml:space="preserve">setup/staging-and-deployment</w:t>
+      </w:r>
+      <w:r>
+        <w:t xml:space="preserve">: </w:t>
+      </w:r>
+      <w:r>
+        <w:rPr>
+          <w:rFonts w:ascii="Consolas" w:cs="Consolas" w:eastAsia="Consolas" w:hAnsi="Consolas"/>
+          <w:sz w:val="19"/>
+          <w:szCs w:val="19"/>
+        </w:rPr>
+        <w:t xml:space="preserve">python build_zip.py</w:t>
+      </w:r>
+      <w:r>
+        <w:t xml:space="preserve"> writes </w:t>
+      </w:r>
+      <w:r>
+        <w:rPr>
+          <w:rFonts w:ascii="Consolas" w:cs="Consolas" w:eastAsia="Consolas" w:hAnsi="Consolas"/>
+          <w:sz w:val="19"/>
+          <w:szCs w:val="19"/>
+        </w:rPr>
+        <w:t xml:space="preserve">dreamsmile-child.zip</w:t>
+      </w:r>
+      <w:r>
+        <w:t xml:space="preserve">.</w:t>
+      </w:r>
+    </w:p>
+    <w:p>
+      <w:pPr>
+        <w:pStyle w:val="ListParagraph"/>
+        <w:numPr>
+          <w:ilvl w:val="0"/>
+          <w:numId w:val="2"/>
+        </w:numPr>
+        <w:spacing w:after="80"/>
+      </w:pPr>
+      <w:r>
+        <w:t xml:space="preserve">In staging’s WordPress admin: Appearance → Themes → Add New Theme → Upload Theme, choose the zip, then </w:t>
+      </w:r>
+      <w:r>
+        <w:rPr>
+          <w:b/>
+          <w:bCs/>
+        </w:rPr>
+        <w:t xml:space="preserve">Replace active with uploaded</w:t>
+      </w:r>
+      <w:r>
+        <w:t xml:space="preserve">.</w:t>
+      </w:r>
+    </w:p>
+    <w:p>
+      <w:pPr>
+        <w:pStyle w:val="ListParagraph"/>
+        <w:numPr>
+          <w:ilvl w:val="0"/>
+          <w:numId w:val="2"/>
+        </w:numPr>
+        <w:spacing w:after="80"/>
+      </w:pPr>
+      <w:r>
+        <w:t xml:space="preserve">Purge the Pressable cache.</w:t>
+      </w:r>
+    </w:p>
+    <w:p>
+      <w:pPr>
+        <w:pStyle w:val="ListParagraph"/>
+        <w:numPr>
+          <w:ilvl w:val="0"/>
+          <w:numId w:val="2"/>
+        </w:numPr>
+        <w:spacing w:after="80"/>
+      </w:pPr>
+      <w:r>
+        <w:t xml:space="preserve">Check: the page source should show </w:t>
+      </w:r>
+      <w:r>
+        <w:rPr>
+          <w:rFonts w:ascii="Consolas" w:cs="Consolas" w:eastAsia="Consolas" w:hAnsi="Consolas"/>
+          <w:sz w:val="19"/>
+          <w:szCs w:val="19"/>
+        </w:rPr>
+        <w:t xml:space="preserve">dreamsmile-child/style.css?ver=</w:t>
+      </w:r>
+      <w:r>
+        <w:t xml:space="preserve"> followed by the new version (anything after 1.2.7).</w:t>
+      </w:r>
+    </w:p>
+    <w:p>
+      <w:pPr>
+        <w:pStyle w:val="Heading2"/>
+      </w:pPr>
+      <w:r>
+        <w:t xml:space="preserve">Step 2: right after the deploy</w:t>
+      </w:r>
+    </w:p>
+    <w:p>
+      <w:pPr>
+        <w:pStyle w:val="ListParagraph"/>
+        <w:numPr>
+          <w:ilvl w:val="0"/>
+          <w:numId w:val="3"/>
+        </w:numPr>
+        <w:spacing w:after="60"/>
+      </w:pPr>
+      <w:r>
+        <w:rPr>
+          <w:b/>
+          <w:bCs/>
+        </w:rPr>
+        <w:t xml:space="preserve">Create the payment page.</w:t>
+      </w:r>
+      <w:r>
+        <w:t xml:space="preserve"> Pages → Add New, title "Make a Payment", slug </w:t>
+      </w:r>
+      <w:r>
+        <w:rPr>
+          <w:rFonts w:ascii="Consolas" w:cs="Consolas" w:eastAsia="Consolas" w:hAnsi="Consolas"/>
+          <w:sz w:val="19"/>
+          <w:szCs w:val="19"/>
+        </w:rPr>
+        <w:t xml:space="preserve">make-a-payment</w:t>
+      </w:r>
+      <w:r>
+        <w:t xml:space="preserve">, leave the content empty, publish. It shows "page not found" on staging right now. Until it exists, the new theme sends /make-a-payment/ to the payment portal, so no link breaks.</w:t>
+      </w:r>
+    </w:p>
+    <w:p>
+      <w:pPr>
+        <w:pStyle w:val="ListParagraph"/>
+        <w:numPr>
+          <w:ilvl w:val="0"/>
+          <w:numId w:val="3"/>
+        </w:numPr>
+        <w:spacing w:after="60"/>
+      </w:pPr>
+      <w:r>
+        <w:rPr>
+          <w:b/>
+          <w:bCs/>
+        </w:rPr>
+        <w:t xml:space="preserve">Remove the old Smile Reveal script.</w:t>
+      </w:r>
+      <w:r>
+        <w:t xml:space="preserve"> It is added just after the site footer: a script tag loading app.smilereveal.io/smile-reveal-funnel.js, plus a script containing a </w:t>
+      </w:r>
+      <w:r>
+        <w:rPr>
+          <w:rFonts w:ascii="Consolas" w:cs="Consolas" w:eastAsia="Consolas" w:hAnsi="Consolas"/>
+          <w:sz w:val="19"/>
+          <w:szCs w:val="19"/>
+        </w:rPr>
+        <w:t xml:space="preserve">placeSmileReveal()</w:t>
+      </w:r>
+      <w:r>
+        <w:t xml:space="preserve"> function. It was written for the old theme and does nothing on the new one, because the theme now places Smile Reveal itself. It was still on staging on October 25.</w:t>
+      </w:r>
+    </w:p>
+    <w:p>
+      <w:pPr>
+        <w:pStyle w:val="ListParagraph"/>
+        <w:numPr>
+          <w:ilvl w:val="0"/>
+          <w:numId w:val="3"/>
+        </w:numPr>
+        <w:spacing w:after="60"/>
+      </w:pPr>
+      <w:r>
+        <w:rPr>
+          <w:b/>
+          <w:bCs/>
+        </w:rPr>
+        <w:t xml:space="preserve">Run the Slim SEO hand-off</w:t>
+      </w:r>
+      <w:r>
+        <w:t xml:space="preserve"> in section 2. It only exists once the new theme is deployed.</w:t>
+      </w:r>
+    </w:p>
+    <w:p>
+      <w:pPr>
+        <w:pStyle w:val="Heading2"/>
+      </w:pPr>
+      <w:r>
+        <w:t xml:space="preserve">Step 3: still open from this response</w:t>
+      </w:r>
+    </w:p>
+    <w:p>
+      <w:pPr>
+        <w:spacing w:after="120"/>
+      </w:pPr>
+      <w:r>
+        <w:t xml:space="preserve">We could only check what is visible from outside the WordPress admin:</w:t>
+      </w:r>
+    </w:p>
+    <w:p>
+      <w:pPr>
+        <w:pStyle w:val="ListParagraph"/>
+        <w:numPr>
+          <w:ilvl w:val="0"/>
+          <w:numId w:val="3"/>
+        </w:numPr>
+        <w:spacing w:after="60"/>
+      </w:pPr>
+      <w:r>
+        <w:rPr>
+          <w:b/>
+          <w:bCs/>
+        </w:rPr>
+        <w:t xml:space="preserve">Redirects (R9, R10): not imported yet.</w:t>
+      </w:r>
+      <w:r>
+        <w:t xml:space="preserve"> On October 25, old addresses such as /about-our-practice/our-services/ and /office-information/make-an-appointment/ still showed "page not found", /winchester/ still redirected through http://, and the theme’s /elkton/ page was still live. Follow the order in section 3: draft the old pages, import the file, then make the manual edits.</w:t>
+      </w:r>
+    </w:p>
+    <w:p>
+      <w:pPr>
+        <w:pStyle w:val="ListParagraph"/>
+        <w:numPr>
+          <w:ilvl w:val="0"/>
+          <w:numId w:val="3"/>
+        </w:numPr>
+        <w:spacing w:after="60"/>
+      </w:pPr>
+      <w:r>
+        <w:rPr>
+          <w:b/>
+          <w:bCs/>
+        </w:rPr>
+        <w:t xml:space="preserve">Not checkable from outside, so skip any already done:</w:t>
+      </w:r>
+      <w:r>
+        <w:t xml:space="preserve"> Tag Manager setup (section 5), the 14 videos (section 6), the business details in Slim SEO Schema (section 4), the blog content in R11 and R22, unpublishing /admin/ and /sitemap/ (R23), and hiding author pages (R31).</w:t>
+      </w:r>
+    </w:p>
+    <w:p>
+      <w:pPr>
+        <w:pStyle w:val="Heading2"/>
+      </w:pPr>
+      <w:r>
+        <w:t xml:space="preserve">Heads-up: town pages now take their text from the theme</w:t>
+      </w:r>
+    </w:p>
+    <w:p>
+      <w:pPr>
+        <w:spacing w:after="120"/>
+      </w:pPr>
+      <w:r>
+        <w:t xml:space="preserve">After the deploy, the Harrisonburg page (/contact-us/dental-implants-harrisonburg-area/) shows the old site’s text word for word in the new layout. That text comes from the theme, so </w:t>
+      </w:r>
+      <w:r>
+        <w:rPr>
+          <w:b/>
+          <w:bCs/>
+        </w:rPr>
+        <w:t xml:space="preserve">edits to the page body in WordPress no longer show</w:t>
+      </w:r>
+      <w:r>
+        <w:t xml:space="preserve">. Please send wording changes to us. The page’s Slim SEO title and description still work as normal.</w:t>
+      </w:r>
+    </w:p>
+    <w:p>
+      <w:pPr>
+        <w:spacing w:after="120"/>
+      </w:pPr>
+      <w:r>
+        <w:t xml:space="preserve">The other seven town pages are built the same way and are ready to go. They keep their current WordPress content until the SEO team confirms they want them moved.</w:t>
+      </w:r>
+    </w:p>
+    <w:p>
+      <w:pPr>
+        <w:pStyle w:val="Heading2"/>
+      </w:pPr>
+      <w:r>
+        <w:t xml:space="preserve">Launch day (not yet)</w:t>
+      </w:r>
+    </w:p>
+    <w:p>
+      <w:pPr>
+        <w:pStyle w:val="ListParagraph"/>
+        <w:numPr>
+          <w:ilvl w:val="0"/>
+          <w:numId w:val="3"/>
+        </w:numPr>
+        <w:spacing w:after="60"/>
+      </w:pPr>
+      <w:r>
+        <w:t xml:space="preserve">Untick "Discourage search engines", confirm Settings → General uses https://www, submit /sitemap.xml in Search Console, and remove the Crawl-delay line (R12, R33).</w:t>
+      </w:r>
+    </w:p>
+    <w:p>
+      <w:pPr>
+        <w:pStyle w:val="ListParagraph"/>
+        <w:numPr>
+          <w:ilvl w:val="0"/>
+          <w:numId w:val="3"/>
+        </w:numPr>
+        <w:spacing w:after="60"/>
+      </w:pPr>
+      <w:r>
+        <w:t xml:space="preserve">Agree who has live-site admin access before the 48 blank live pages are set to draft (R17).</w:t>
+      </w:r>
+    </w:p>
+    <w:p>
+      <w:pPr>
+        <w:pStyle w:val="Heading1"/>
+      </w:pPr>
+      <w:r>
+        <w:t xml:space="preserve">At a glance</w:t>
+      </w:r>
+    </w:p>
+    <w:p>
+      <w:pPr>
+        <w:pStyle w:val="ListParagraph"/>
+        <w:numPr>
+          <w:ilvl w:val="0"/>
+          <w:numId w:val="3"/>
+        </w:numPr>
         <w:spacing w:after="60"/>
       </w:pPr>
       <w:r>
@@ -79,7 +455,7 @@
         <w:pStyle w:val="ListParagraph"/>
         <w:numPr>
           <w:ilvl w:val="0"/>
-          <w:numId w:val="2"/>
+          <w:numId w:val="3"/>
         </w:numPr>
         <w:spacing w:after="60"/>
       </w:pPr>
@@ -99,7 +475,7 @@
         <w:pStyle w:val="ListParagraph"/>
         <w:numPr>
           <w:ilvl w:val="0"/>
-          <w:numId w:val="2"/>
+          <w:numId w:val="3"/>
         </w:numPr>
         <w:spacing w:after="60"/>
       </w:pPr>
@@ -119,7 +495,7 @@
         <w:pStyle w:val="ListParagraph"/>
         <w:numPr>
           <w:ilvl w:val="0"/>
-          <w:numId w:val="2"/>
+          <w:numId w:val="3"/>
         </w:numPr>
         <w:spacing w:after="60"/>
       </w:pPr>
@@ -139,7 +515,7 @@
         <w:pStyle w:val="ListParagraph"/>
         <w:numPr>
           <w:ilvl w:val="0"/>
-          <w:numId w:val="2"/>
+          <w:numId w:val="3"/>
         </w:numPr>
         <w:spacing w:after="60"/>
       </w:pPr>
@@ -151,7 +527,7 @@
         <w:t xml:space="preserve">Online bill payment is live in the theme:</w:t>
       </w:r>
       <w:r>
-        <w:t xml:space="preserve"> a new Pay Your Bill page with the payment button and QR code (section 7).</w:t>
+        <w:t xml:space="preserve"> a Make a Payment page with the payment button and QR code (section 7).</w:t>
       </w:r>
     </w:p>
     <w:p>
@@ -159,7 +535,7 @@
         <w:pStyle w:val="ListParagraph"/>
         <w:numPr>
           <w:ilvl w:val="0"/>
-          <w:numId w:val="2"/>
+          <w:numId w:val="3"/>
         </w:numPr>
         <w:spacing w:after="60"/>
       </w:pPr>
@@ -5757,7 +6133,7 @@
         <w:pStyle w:val="ListParagraph"/>
         <w:numPr>
           <w:ilvl w:val="0"/>
-          <w:numId w:val="3"/>
+          <w:numId w:val="4"/>
         </w:numPr>
         <w:spacing w:after="80"/>
       </w:pPr>
@@ -5770,7 +6146,7 @@
         <w:pStyle w:val="ListParagraph"/>
         <w:numPr>
           <w:ilvl w:val="0"/>
-          <w:numId w:val="3"/>
+          <w:numId w:val="4"/>
         </w:numPr>
         <w:spacing w:after="80"/>
       </w:pPr>
@@ -5794,7 +6170,7 @@
         <w:pStyle w:val="ListParagraph"/>
         <w:numPr>
           <w:ilvl w:val="0"/>
-          <w:numId w:val="3"/>
+          <w:numId w:val="4"/>
         </w:numPr>
         <w:spacing w:after="80"/>
       </w:pPr>
@@ -5825,7 +6201,7 @@
         <w:pStyle w:val="ListParagraph"/>
         <w:numPr>
           <w:ilvl w:val="0"/>
-          <w:numId w:val="2"/>
+          <w:numId w:val="3"/>
         </w:numPr>
         <w:spacing w:after="60"/>
       </w:pPr>
@@ -5848,7 +6224,7 @@
         <w:pStyle w:val="ListParagraph"/>
         <w:numPr>
           <w:ilvl w:val="0"/>
-          <w:numId w:val="2"/>
+          <w:numId w:val="3"/>
         </w:numPr>
         <w:spacing w:after="60"/>
       </w:pPr>
@@ -5861,7 +6237,7 @@
         <w:pStyle w:val="ListParagraph"/>
         <w:numPr>
           <w:ilvl w:val="0"/>
-          <w:numId w:val="2"/>
+          <w:numId w:val="3"/>
         </w:numPr>
         <w:spacing w:after="60"/>
       </w:pPr>
@@ -5874,7 +6250,7 @@
         <w:pStyle w:val="ListParagraph"/>
         <w:numPr>
           <w:ilvl w:val="0"/>
-          <w:numId w:val="2"/>
+          <w:numId w:val="3"/>
         </w:numPr>
         <w:spacing w:after="60"/>
       </w:pPr>
@@ -5922,7 +6298,7 @@
         <w:pStyle w:val="ListParagraph"/>
         <w:numPr>
           <w:ilvl w:val="0"/>
-          <w:numId w:val="2"/>
+          <w:numId w:val="3"/>
         </w:numPr>
         <w:spacing w:after="60"/>
       </w:pPr>
@@ -5935,7 +6311,7 @@
         <w:pStyle w:val="ListParagraph"/>
         <w:numPr>
           <w:ilvl w:val="0"/>
-          <w:numId w:val="2"/>
+          <w:numId w:val="3"/>
         </w:numPr>
         <w:spacing w:after="60"/>
       </w:pPr>
@@ -5948,7 +6324,7 @@
         <w:pStyle w:val="ListParagraph"/>
         <w:numPr>
           <w:ilvl w:val="0"/>
-          <w:numId w:val="2"/>
+          <w:numId w:val="3"/>
         </w:numPr>
         <w:spacing w:after="60"/>
       </w:pPr>
@@ -7441,7 +7817,7 @@
         <w:pStyle w:val="ListParagraph"/>
         <w:numPr>
           <w:ilvl w:val="0"/>
-          <w:numId w:val="2"/>
+          <w:numId w:val="3"/>
         </w:numPr>
         <w:spacing w:after="60"/>
       </w:pPr>
@@ -7454,7 +7830,7 @@
         <w:pStyle w:val="ListParagraph"/>
         <w:numPr>
           <w:ilvl w:val="0"/>
-          <w:numId w:val="2"/>
+          <w:numId w:val="3"/>
         </w:numPr>
         <w:spacing w:after="60"/>
       </w:pPr>
@@ -7467,7 +7843,7 @@
         <w:pStyle w:val="ListParagraph"/>
         <w:numPr>
           <w:ilvl w:val="0"/>
-          <w:numId w:val="2"/>
+          <w:numId w:val="3"/>
         </w:numPr>
         <w:spacing w:after="60"/>
       </w:pPr>
@@ -7496,7 +7872,7 @@
         <w:pStyle w:val="ListParagraph"/>
         <w:numPr>
           <w:ilvl w:val="0"/>
-          <w:numId w:val="2"/>
+          <w:numId w:val="3"/>
         </w:numPr>
         <w:spacing w:after="60"/>
       </w:pPr>
@@ -7514,7 +7890,7 @@
         <w:pStyle w:val="ListParagraph"/>
         <w:numPr>
           <w:ilvl w:val="0"/>
-          <w:numId w:val="2"/>
+          <w:numId w:val="3"/>
         </w:numPr>
         <w:spacing w:after="60"/>
       </w:pPr>
@@ -7532,7 +7908,7 @@
         <w:pStyle w:val="ListParagraph"/>
         <w:numPr>
           <w:ilvl w:val="0"/>
-          <w:numId w:val="2"/>
+          <w:numId w:val="3"/>
         </w:numPr>
         <w:spacing w:after="60"/>
       </w:pPr>
@@ -7550,7 +7926,7 @@
         <w:pStyle w:val="ListParagraph"/>
         <w:numPr>
           <w:ilvl w:val="0"/>
-          <w:numId w:val="2"/>
+          <w:numId w:val="3"/>
         </w:numPr>
         <w:spacing w:after="60"/>
       </w:pPr>
@@ -7568,7 +7944,7 @@
         <w:pStyle w:val="ListParagraph"/>
         <w:numPr>
           <w:ilvl w:val="0"/>
-          <w:numId w:val="2"/>
+          <w:numId w:val="3"/>
         </w:numPr>
         <w:spacing w:after="60"/>
       </w:pPr>
@@ -7586,7 +7962,7 @@
         <w:pStyle w:val="ListParagraph"/>
         <w:numPr>
           <w:ilvl w:val="0"/>
-          <w:numId w:val="2"/>
+          <w:numId w:val="3"/>
         </w:numPr>
         <w:spacing w:after="60"/>
       </w:pPr>
@@ -7604,7 +7980,7 @@
         <w:pStyle w:val="ListParagraph"/>
         <w:numPr>
           <w:ilvl w:val="0"/>
-          <w:numId w:val="2"/>
+          <w:numId w:val="3"/>
         </w:numPr>
         <w:spacing w:after="60"/>
       </w:pPr>
@@ -7622,7 +7998,7 @@
         <w:pStyle w:val="ListParagraph"/>
         <w:numPr>
           <w:ilvl w:val="0"/>
-          <w:numId w:val="2"/>
+          <w:numId w:val="3"/>
         </w:numPr>
         <w:spacing w:after="60"/>
       </w:pPr>
@@ -7640,7 +8016,7 @@
         <w:pStyle w:val="ListParagraph"/>
         <w:numPr>
           <w:ilvl w:val="0"/>
-          <w:numId w:val="2"/>
+          <w:numId w:val="3"/>
         </w:numPr>
         <w:spacing w:after="60"/>
       </w:pPr>
@@ -7658,7 +8034,7 @@
         <w:pStyle w:val="ListParagraph"/>
         <w:numPr>
           <w:ilvl w:val="0"/>
-          <w:numId w:val="2"/>
+          <w:numId w:val="3"/>
         </w:numPr>
         <w:spacing w:after="60"/>
       </w:pPr>
@@ -7676,7 +8052,7 @@
         <w:pStyle w:val="ListParagraph"/>
         <w:numPr>
           <w:ilvl w:val="0"/>
-          <w:numId w:val="2"/>
+          <w:numId w:val="3"/>
         </w:numPr>
         <w:spacing w:after="60"/>
       </w:pPr>
@@ -7694,7 +8070,7 @@
         <w:pStyle w:val="ListParagraph"/>
         <w:numPr>
           <w:ilvl w:val="0"/>
-          <w:numId w:val="2"/>
+          <w:numId w:val="3"/>
         </w:numPr>
         <w:spacing w:after="60"/>
       </w:pPr>
@@ -7712,7 +8088,7 @@
         <w:pStyle w:val="ListParagraph"/>
         <w:numPr>
           <w:ilvl w:val="0"/>
-          <w:numId w:val="2"/>
+          <w:numId w:val="3"/>
         </w:numPr>
         <w:spacing w:after="60"/>
       </w:pPr>
@@ -7730,7 +8106,7 @@
         <w:pStyle w:val="ListParagraph"/>
         <w:numPr>
           <w:ilvl w:val="0"/>
-          <w:numId w:val="2"/>
+          <w:numId w:val="3"/>
         </w:numPr>
         <w:spacing w:after="60"/>
       </w:pPr>
@@ -7761,10 +8137,32 @@
     </w:p>
     <w:p>
       <w:pPr>
+        <w:spacing w:after="120"/>
+        <w:rPr>
+          <w:color w:val="9A5A00"/>
+        </w:rPr>
+      </w:pPr>
+      <w:r>
+        <w:rPr>
+          <w:b/>
+          <w:bCs/>
+          <w:color w:val="9A5A00"/>
+        </w:rPr>
+        <w:t xml:space="preserve">Update, October 25:</w:t>
+      </w:r>
+      <w:r>
+        <w:rPr>
+          <w:color w:val="9A5A00"/>
+        </w:rPr>
+        <w:t xml:space="preserve"> the page now lives at /make-a-payment/, the old site’s address for it, and carries the old page’s text word for word. Create it with the title "Make a Payment" and the slug make-a-payment (see the update at the top). The rest of this section describes the October 20 version.</w:t>
+      </w:r>
+    </w:p>
+    <w:p>
+      <w:pPr>
         <w:pStyle w:val="ListParagraph"/>
         <w:numPr>
           <w:ilvl w:val="0"/>
-          <w:numId w:val="2"/>
+          <w:numId w:val="3"/>
         </w:numPr>
         <w:spacing w:after="60"/>
       </w:pPr>
@@ -7784,7 +8182,7 @@
         <w:pStyle w:val="ListParagraph"/>
         <w:numPr>
           <w:ilvl w:val="0"/>
-          <w:numId w:val="2"/>
+          <w:numId w:val="3"/>
         </w:numPr>
         <w:spacing w:after="60"/>
       </w:pPr>
@@ -7804,7 +8202,7 @@
         <w:pStyle w:val="ListParagraph"/>
         <w:numPr>
           <w:ilvl w:val="0"/>
-          <w:numId w:val="2"/>
+          <w:numId w:val="3"/>
         </w:numPr>
         <w:spacing w:after="60"/>
       </w:pPr>
@@ -7824,7 +8222,7 @@
         <w:pStyle w:val="ListParagraph"/>
         <w:numPr>
           <w:ilvl w:val="0"/>
-          <w:numId w:val="2"/>
+          <w:numId w:val="3"/>
         </w:numPr>
         <w:spacing w:after="60"/>
       </w:pPr>
@@ -7844,7 +8242,7 @@
         <w:pStyle w:val="ListParagraph"/>
         <w:numPr>
           <w:ilvl w:val="0"/>
-          <w:numId w:val="2"/>
+          <w:numId w:val="3"/>
         </w:numPr>
         <w:spacing w:after="60"/>
       </w:pPr>
@@ -7934,7 +8332,7 @@
         <w:pStyle w:val="ListParagraph"/>
         <w:numPr>
           <w:ilvl w:val="0"/>
-          <w:numId w:val="4"/>
+          <w:numId w:val="5"/>
         </w:numPr>
         <w:spacing w:after="80"/>
       </w:pPr>
@@ -7947,7 +8345,7 @@
         <w:pStyle w:val="ListParagraph"/>
         <w:numPr>
           <w:ilvl w:val="0"/>
-          <w:numId w:val="4"/>
+          <w:numId w:val="5"/>
         </w:numPr>
         <w:spacing w:after="80"/>
       </w:pPr>
@@ -7960,7 +8358,7 @@
         <w:pStyle w:val="ListParagraph"/>
         <w:numPr>
           <w:ilvl w:val="0"/>
-          <w:numId w:val="4"/>
+          <w:numId w:val="5"/>
         </w:numPr>
         <w:spacing w:after="80"/>
       </w:pPr>
@@ -7973,7 +8371,7 @@
         <w:pStyle w:val="ListParagraph"/>
         <w:numPr>
           <w:ilvl w:val="0"/>
-          <w:numId w:val="4"/>
+          <w:numId w:val="5"/>
         </w:numPr>
         <w:spacing w:after="80"/>
       </w:pPr>
@@ -7986,7 +8384,7 @@
         <w:pStyle w:val="ListParagraph"/>
         <w:numPr>
           <w:ilvl w:val="0"/>
-          <w:numId w:val="4"/>
+          <w:numId w:val="5"/>
         </w:numPr>
         <w:spacing w:after="80"/>
       </w:pPr>
@@ -8015,12 +8413,12 @@
         <w:pStyle w:val="ListParagraph"/>
         <w:numPr>
           <w:ilvl w:val="0"/>
-          <w:numId w:val="2"/>
+          <w:numId w:val="3"/>
         </w:numPr>
         <w:spacing w:after="60"/>
       </w:pPr>
       <w:r>
-        <w:t xml:space="preserve">Upload the updated theme (version 1.3.0) to staging and clear the Pressable cache.</w:t>
+        <w:t xml:space="preserve">Deploy the theme and create the Make a Payment page: see the October 25 update at the top.</w:t>
       </w:r>
     </w:p>
     <w:p>
@@ -8028,12 +8426,12 @@
         <w:pStyle w:val="ListParagraph"/>
         <w:numPr>
           <w:ilvl w:val="0"/>
-          <w:numId w:val="2"/>
+          <w:numId w:val="3"/>
         </w:numPr>
         <w:spacing w:after="60"/>
       </w:pPr>
       <w:r>
-        <w:t xml:space="preserve">Create the Pay Your Bill page, and confirm the payment link opens in a normal browser.</w:t>
+        <w:t xml:space="preserve">Confirm the payment link opens in a normal browser.</w:t>
       </w:r>
     </w:p>
     <w:p>
@@ -8049,7 +8447,7 @@
         <w:pStyle w:val="ListParagraph"/>
         <w:numPr>
           <w:ilvl w:val="0"/>
-          <w:numId w:val="2"/>
+          <w:numId w:val="3"/>
         </w:numPr>
         <w:spacing w:after="60"/>
       </w:pPr>
@@ -8062,7 +8460,7 @@
         <w:pStyle w:val="ListParagraph"/>
         <w:numPr>
           <w:ilvl w:val="0"/>
-          <w:numId w:val="2"/>
+          <w:numId w:val="3"/>
         </w:numPr>
         <w:spacing w:after="60"/>
       </w:pPr>
@@ -8075,7 +8473,7 @@
         <w:pStyle w:val="ListParagraph"/>
         <w:numPr>
           <w:ilvl w:val="0"/>
-          <w:numId w:val="2"/>
+          <w:numId w:val="3"/>
         </w:numPr>
         <w:spacing w:after="60"/>
       </w:pPr>
@@ -8088,7 +8486,7 @@
         <w:pStyle w:val="ListParagraph"/>
         <w:numPr>
           <w:ilvl w:val="0"/>
-          <w:numId w:val="2"/>
+          <w:numId w:val="3"/>
         </w:numPr>
         <w:spacing w:after="60"/>
       </w:pPr>
@@ -8101,7 +8499,7 @@
         <w:pStyle w:val="ListParagraph"/>
         <w:numPr>
           <w:ilvl w:val="0"/>
-          <w:numId w:val="2"/>
+          <w:numId w:val="3"/>
         </w:numPr>
         <w:spacing w:after="60"/>
       </w:pPr>
@@ -8114,7 +8512,7 @@
         <w:pStyle w:val="ListParagraph"/>
         <w:numPr>
           <w:ilvl w:val="0"/>
-          <w:numId w:val="2"/>
+          <w:numId w:val="3"/>
         </w:numPr>
         <w:spacing w:after="60"/>
       </w:pPr>
@@ -8135,7 +8533,7 @@
         <w:pStyle w:val="ListParagraph"/>
         <w:numPr>
           <w:ilvl w:val="0"/>
-          <w:numId w:val="2"/>
+          <w:numId w:val="3"/>
         </w:numPr>
         <w:spacing w:after="60"/>
       </w:pPr>
@@ -8148,7 +8546,7 @@
         <w:pStyle w:val="ListParagraph"/>
         <w:numPr>
           <w:ilvl w:val="0"/>
-          <w:numId w:val="2"/>
+          <w:numId w:val="3"/>
         </w:numPr>
         <w:spacing w:after="60"/>
       </w:pPr>
@@ -8169,7 +8567,7 @@
         <w:pStyle w:val="ListParagraph"/>
         <w:numPr>
           <w:ilvl w:val="0"/>
-          <w:numId w:val="2"/>
+          <w:numId w:val="3"/>
         </w:numPr>
         <w:spacing w:after="60"/>
       </w:pPr>
@@ -8443,6 +8841,18 @@
       </w:pPr>
     </w:lvl>
   </w:abstractNum>
+  <w:abstractNum w:abstractNumId="5" w15:restartNumberingAfterBreak="0">
+    <w:multiLevelType w:val="hybridMultilevel"/>
+    <w:lvl w:ilvl="0" w:tentative="1">
+      <w:start w:val="1"/>
+      <w:numFmt w:val="decimal"/>
+      <w:lvlText w:val="%1."/>
+      <w:lvlJc w:val="left"/>
+      <w:pPr>
+        <w:ind w:left="540" w:hanging="300"/>
+      </w:pPr>
+    </w:lvl>
+  </w:abstractNum>
   <w:num w:numId="1">
     <w:abstractNumId w:val="1"/>
     <w:lvlOverride w:ilvl="0">
@@ -8450,6 +8860,12 @@
     </w:lvlOverride>
   </w:num>
   <w:num w:numId="2">
+    <w:abstractNumId w:val="4"/>
+    <w:lvlOverride w:ilvl="0">
+      <w:startOverride w:val="1"/>
+    </w:lvlOverride>
+  </w:num>
+  <w:num w:numId="3">
     <w:abstractNumId w:val="2"/>
     <w:lvlOverride w:ilvl="0">
       <w:startOverride w:val="1"/>
@@ -8458,14 +8874,14 @@
       <w:startOverride w:val="1"/>
     </w:lvlOverride>
   </w:num>
-  <w:num w:numId="3">
+  <w:num w:numId="4">
     <w:abstractNumId w:val="3"/>
     <w:lvlOverride w:ilvl="0">
       <w:startOverride w:val="1"/>
     </w:lvlOverride>
   </w:num>
-  <w:num w:numId="4">
-    <w:abstractNumId w:val="4"/>
+  <w:num w:numId="5">
+    <w:abstractNumId w:val="5"/>
     <w:lvlOverride w:ilvl="0">
       <w:startOverride w:val="1"/>
     </w:lvlOverride>

</xml_diff>

<commit_message>
docs: bring the staging handover up to date after PR #5
Section 0 of the SEO tracker response (Markdown and Word):
- four merged updates now, theme 1.5.2; the deploy check names 1.5.2
- staging re-checked 2026-10-26: still 1.2.7, old Smile Reveal script
  still present, /make-a-payment/ still 404, redirects not imported
- new heads-up: posts, /blog/ and category pages use the theme's own
  layout; posts no longer show a comment form, and the /blog/ H1 is
  fixed as "Blog"
- R16 row no longer says /blog/ takes its H1 from the page title

Co-Authored-By: Claude Opus 5.5 <noreply@anthropic.com>
</commit_message>
<xml_diff>
--- a/docs/seo/Dr-Burns-SEO-Tracker-Developer-Response-2026-10-20.docx
+++ b/docs/seo/Dr-Burns-SEO-Tracker-Developer-Response-2026-10-20.docx
@@ -37,7 +37,7 @@
         <w:rPr>
           <w:color w:val="6B6B6B"/>
         </w:rPr>
-        <w:t xml:space="preserve">October 20, 2026 · updated October 25, 2026</w:t>
+        <w:t xml:space="preserve">October 20, 2026 · updated October 26, 2026</w:t>
       </w:r>
       <w:r>
         <w:rPr>
@@ -51,7 +51,7 @@
         <w:pStyle w:val="Heading1"/>
       </w:pPr>
       <w:r>
-        <w:t xml:space="preserve">Update, October 25: staging steps, in order</w:t>
+        <w:t xml:space="preserve">Update, October 26: staging steps, in order</w:t>
       </w:r>
     </w:p>
     <w:p>
@@ -59,7 +59,17 @@
         <w:spacing w:after="120"/>
       </w:pPr>
       <w:r>
-        <w:t xml:space="preserve">Three updates are now merged: this SEO tracker work, the GoHighLevel quiz, smile preview and free guide, and the Harrisonburg and Make a Payment pages. The </w:t>
+        <w:t xml:space="preserve">Four updates are now merged: this SEO tracker work, the GoHighLevel quiz, smile preview and free guide, the Harrisonburg and Make a Payment pages, and a visual pass over every page with proper blog layouts (theme </w:t>
+      </w:r>
+      <w:r>
+        <w:rPr>
+          <w:b/>
+          <w:bCs/>
+        </w:rPr>
+        <w:t xml:space="preserve">1.5.2</w:t>
+      </w:r>
+      <w:r>
+        <w:t xml:space="preserve">). The </w:t>
       </w:r>
       <w:r>
         <w:rPr>
@@ -91,7 +101,7 @@
         <w:t xml:space="preserve">1.2.7</w:t>
       </w:r>
       <w:r>
-        <w:t xml:space="preserve"> when we checked on October 25, so none of this is visible there yet.</w:t>
+        <w:t xml:space="preserve"> when we checked on October 26, so none of this is visible there yet.</w:t>
       </w:r>
     </w:p>
     <w:p>
@@ -202,10 +212,10 @@
           <w:sz w:val="19"/>
           <w:szCs w:val="19"/>
         </w:rPr>
-        <w:t xml:space="preserve">dreamsmile-child/style.css?ver=</w:t>
-      </w:r>
-      <w:r>
-        <w:t xml:space="preserve"> followed by the new version (anything after 1.2.7).</w:t>
+        <w:t xml:space="preserve">dreamsmile-child/style.css?ver=1.5.2</w:t>
+      </w:r>
+      <w:r>
+        <w:t xml:space="preserve"> (or a later version). If it still says 1.2.7, the old theme is still active or the cache was not purged.</w:t>
       </w:r>
     </w:p>
     <w:p>
@@ -275,7 +285,7 @@
         <w:t xml:space="preserve">placeSmileReveal()</w:t>
       </w:r>
       <w:r>
-        <w:t xml:space="preserve"> function. It was written for the old theme and does nothing on the new one, because the theme now places Smile Reveal itself. It was still on staging on October 25.</w:t>
+        <w:t xml:space="preserve"> function. It was written for the old theme and does nothing on the new one, because the theme now places Smile Reveal itself. It was still on staging on October 26.</w:t>
       </w:r>
     </w:p>
     <w:p>
@@ -331,7 +341,7 @@
         <w:t xml:space="preserve">Redirects (R9, R10): not imported yet.</w:t>
       </w:r>
       <w:r>
-        <w:t xml:space="preserve"> On October 25, old addresses such as /about-our-practice/our-services/ and /office-information/make-an-appointment/ still showed "page not found", /winchester/ still redirected through http://, and the theme’s /elkton/ page was still live. Follow the order in section 3: draft the old pages, import the file, then make the manual edits.</w:t>
+        <w:t xml:space="preserve"> On October 26, old addresses such as /about-our-practice/our-services/ and /office-information/make-an-appointment/ still showed "page not found", /winchester/ still redirected through http://, and the theme’s /elkton/ page was still live. Follow the order in section 3: draft the old pages, import the file, then make the manual edits.</w:t>
       </w:r>
     </w:p>
     <w:p>
@@ -386,6 +396,62 @@
       </w:pPr>
       <w:r>
         <w:t xml:space="preserve">The other seven town pages are built the same way and are ready to go. They keep their current WordPress content until the SEO team confirms they want them moved.</w:t>
+      </w:r>
+    </w:p>
+    <w:p>
+      <w:pPr>
+        <w:pStyle w:val="Heading2"/>
+      </w:pPr>
+      <w:r>
+        <w:t xml:space="preserve">Heads-up: blog posts and /blog/ now use the site’s own layout</w:t>
+      </w:r>
+    </w:p>
+    <w:p>
+      <w:pPr>
+        <w:spacing w:after="120"/>
+      </w:pPr>
+      <w:r>
+        <w:t xml:space="preserve">Until now the theme had no blog layout, so posts, /blog/ and category pages fell back to WordPress’s default look. After the deploy they use the same design as the rest of the site: an article header, the reading column, and post cards on /blog/. Two things behave differently:</w:t>
+      </w:r>
+    </w:p>
+    <w:p>
+      <w:pPr>
+        <w:pStyle w:val="ListParagraph"/>
+        <w:numPr>
+          <w:ilvl w:val="0"/>
+          <w:numId w:val="3"/>
+        </w:numPr>
+        <w:spacing w:after="60"/>
+      </w:pPr>
+      <w:r>
+        <w:rPr>
+          <w:b/>
+          <w:bCs/>
+        </w:rPr>
+        <w:t xml:space="preserve">Posts no longer show a comment form.</w:t>
+      </w:r>
+      <w:r>
+        <w:t xml:space="preserve"> Existing comments stay in WordPress; they just aren’t displayed. Tell us if the practice wants comments on.</w:t>
+      </w:r>
+    </w:p>
+    <w:p>
+      <w:pPr>
+        <w:pStyle w:val="ListParagraph"/>
+        <w:numPr>
+          <w:ilvl w:val="0"/>
+          <w:numId w:val="3"/>
+        </w:numPr>
+        <w:spacing w:after="60"/>
+      </w:pPr>
+      <w:r>
+        <w:rPr>
+          <w:b/>
+          <w:bCs/>
+        </w:rPr>
+        <w:t xml:space="preserve">The main heading on /blog/ is fixed as "Blog".</w:t>
+      </w:r>
+      <w:r>
+        <w:t xml:space="preserve"> Renaming the Blog page in WordPress changes nothing on the page itself; its Slim SEO title and description still work as normal. Category pages use the category name as their heading. Ask us if you want different wording.</w:t>
       </w:r>
     </w:p>
     <w:p>

</xml_diff>

<commit_message>
docs: handover covers all eight town pages (theme 1.6.1)
Section 0 of the SEO tracker response (Markdown and Word): five merged
updates, the deploy check looks for 1.6.1, and the town-pages heads-up
now says all eight /contact-us/ pages share Harrisonburg's layout with
their existing old-site wording, that body edits in WordPress no longer
show (Slim SEO titles/descriptions still do), and that the pasted-in
reviews widget and "Consultation" button are replaced.

Co-Authored-By: Claude Opus 5.5 <noreply@anthropic.com>
</commit_message>
<xml_diff>
--- a/docs/seo/Dr-Burns-SEO-Tracker-Developer-Response-2026-10-20.docx
+++ b/docs/seo/Dr-Burns-SEO-Tracker-Developer-Response-2026-10-20.docx
@@ -59,14 +59,14 @@
         <w:spacing w:after="120"/>
       </w:pPr>
       <w:r>
-        <w:t xml:space="preserve">Four updates are now merged: this SEO tracker work, the GoHighLevel quiz, smile preview and free guide, the Harrisonburg and Make a Payment pages, and a visual pass over every page with proper blog layouts (theme </w:t>
+        <w:t xml:space="preserve">Five updates are now merged: this SEO tracker work, the GoHighLevel quiz, smile preview and free guide, the Harrisonburg and Make a Payment pages, a visual pass over every page with proper blog layouts, and the other seven town pages in Harrisonburg’s layout (theme </w:t>
       </w:r>
       <w:r>
         <w:rPr>
           <w:b/>
           <w:bCs/>
         </w:rPr>
-        <w:t xml:space="preserve">1.5.2</w:t>
+        <w:t xml:space="preserve">1.6.1</w:t>
       </w:r>
       <w:r>
         <w:t xml:space="preserve">). The </w:t>
@@ -212,7 +212,7 @@
           <w:sz w:val="19"/>
           <w:szCs w:val="19"/>
         </w:rPr>
-        <w:t xml:space="preserve">dreamsmile-child/style.css?ver=1.5.2</w:t>
+        <w:t xml:space="preserve">dreamsmile-child/style.css?ver=1.6.1</w:t>
       </w:r>
       <w:r>
         <w:t xml:space="preserve"> (or a later version). If it still says 1.2.7, the old theme is still active or the cache was not purged.</w:t>
@@ -369,7 +369,7 @@
         <w:pStyle w:val="Heading2"/>
       </w:pPr>
       <w:r>
-        <w:t xml:space="preserve">Heads-up: town pages now take their text from the theme</w:t>
+        <w:t xml:space="preserve">Heads-up: all eight town pages now take their text from the theme</w:t>
       </w:r>
     </w:p>
     <w:p>
@@ -377,25 +377,25 @@
         <w:spacing w:after="120"/>
       </w:pPr>
       <w:r>
-        <w:t xml:space="preserve">After the deploy, the Harrisonburg page (/contact-us/dental-implants-harrisonburg-area/) shows the old site’s text word for word in the new layout. That text comes from the theme, so </w:t>
+        <w:t xml:space="preserve">After the deploy, the Harrisonburg page (/contact-us/dental-implants-harrisonburg-area/) shows the old site’s text word for word in the new layout, as the client asked. The other seven town pages (Winchester, Elkton, Bridgewater, Woodstock, Luray, Broadway, Timberville) now use the same layout, so all eight match. Their wording does not change: it is the same old-site text they already have in WordPress.</w:t>
+      </w:r>
+    </w:p>
+    <w:p>
+      <w:pPr>
+        <w:spacing w:after="120"/>
+      </w:pPr>
+      <w:r>
+        <w:t xml:space="preserve">That text now comes from the theme, so </w:t>
       </w:r>
       <w:r>
         <w:rPr>
           <w:b/>
           <w:bCs/>
         </w:rPr>
-        <w:t xml:space="preserve">edits to the page body in WordPress no longer show</w:t>
-      </w:r>
-      <w:r>
-        <w:t xml:space="preserve">. Please send wording changes to us. The page’s Slim SEO title and description still work as normal.</w:t>
-      </w:r>
-    </w:p>
-    <w:p>
-      <w:pPr>
-        <w:spacing w:after="120"/>
-      </w:pPr>
-      <w:r>
-        <w:t xml:space="preserve">The other seven town pages are built the same way and are ready to go. They keep their current WordPress content until the SEO team confirms they want them moved.</w:t>
+        <w:t xml:space="preserve">edits to the body of any of the eight pages in WordPress no longer show</w:t>
+      </w:r>
+      <w:r>
+        <w:t xml:space="preserve">. Please send wording changes to us. Each page’s Slim SEO title and description still work as normal, so headline changes after Oliver’s edits can still be made in Slim SEO. The Google reviews widget and the "Schedule Your Dream Smile Consultation" button that were pasted into the seven pages are replaced by the same blocks Harrisonburg uses.</w:t>
       </w:r>
     </w:p>
     <w:p>

</xml_diff>